<commit_message>
Promote SSL14 to NXT latest
</commit_message>
<xml_diff>
--- a/latest/NXT_Latest_NXT33_System_And_Indicators.docx
+++ b/latest/NXT_Latest_NXT33_System_And_Indicators.docx
@@ -7,12 +7,12 @@
         <w:pStyle w:val="Title"/>
       </w:pPr>
       <w:r>
-        <w:t>NXT v3.3 Simple - Binance Native 1D</w:t>
+        <w:t>NXT v3.3 Latest System And Indicators</w:t>
       </w:r>
     </w:p>
     <w:p>
       <w:r>
-        <w:t>Latest selected system: Binance native daily candles, Runner A, anti-immediate-reversal, no continuation module, no risk-off overlay.</w:t>
+        <w:t>Current promoted latest system: NXT v3.3 with SSL Channel period 14.</w:t>
       </w:r>
     </w:p>
     <w:p>
@@ -72,7 +72,7 @@
           </w:tcPr>
           <w:p>
             <w:r>
-              <w:t>NXT v3.3 Simple + Binance Native 1D + Runner A + Anti-Immediate-Reversal + No Continuation + No Risk-Off</w:t>
+              <w:t>NXT v3.3 Simple + Binance Native 1D + SSL14 + Runner A + Anti-Immediate-Reversal + No Continuation + No Risk-Off</w:t>
             </w:r>
           </w:p>
         </w:tc>
@@ -106,6 +106,28 @@
           </w:tcPr>
           <w:p>
             <w:r>
+              <w:t>SSL period</w:t>
+            </w:r>
+          </w:p>
+        </w:tc>
+        <w:tc>
+          <w:tcPr>
+            <w:tcW w:type="dxa" w:w="4320"/>
+          </w:tcPr>
+          <w:p>
+            <w:r>
+              <w:t>14</w:t>
+            </w:r>
+          </w:p>
+        </w:tc>
+      </w:tr>
+      <w:tr>
+        <w:tc>
+          <w:tcPr>
+            <w:tcW w:type="dxa" w:w="4320"/>
+          </w:tcPr>
+          <w:p>
+            <w:r>
               <w:t>Trades</w:t>
             </w:r>
           </w:p>
@@ -116,7 +138,7 @@
           </w:tcPr>
           <w:p>
             <w:r>
-              <w:t>155</w:t>
+              <w:t>161</w:t>
             </w:r>
           </w:p>
         </w:tc>
@@ -138,7 +160,7 @@
           </w:tcPr>
           <w:p>
             <w:r>
-              <w:t>52.26%</w:t>
+              <w:t>49.07%</w:t>
             </w:r>
           </w:p>
         </w:tc>
@@ -160,7 +182,7 @@
           </w:tcPr>
           <w:p>
             <w:r>
-              <w:t>76.42R</w:t>
+              <w:t>80.07R</w:t>
             </w:r>
           </w:p>
         </w:tc>
@@ -182,7 +204,7 @@
           </w:tcPr>
           <w:p>
             <w:r>
-              <w:t>0.49R</w:t>
+              <w:t>0.50R</w:t>
             </w:r>
           </w:p>
         </w:tc>
@@ -204,7 +226,7 @@
           </w:tcPr>
           <w:p>
             <w:r>
-              <w:t>-10.63R</w:t>
+              <w:t>-7.51R</w:t>
             </w:r>
           </w:p>
         </w:tc>
@@ -226,7 +248,7 @@
           </w:tcPr>
           <w:p>
             <w:r>
-              <w:t>$96,416.96</w:t>
+              <w:t>$100,074.13</w:t>
             </w:r>
           </w:p>
         </w:tc>
@@ -237,7 +259,7 @@
         <w:pStyle w:val="Heading1"/>
       </w:pPr>
       <w:r>
-        <w:t>Rules</w:t>
+        <w:t>Current Rules</w:t>
       </w:r>
     </w:p>
     <w:p>
@@ -245,7 +267,7 @@
         <w:pStyle w:val="ListBullet"/>
       </w:pPr>
       <w:r>
-        <w:t>Daily candles use Binance native 1D klines, matching TradingView BTCUSDT 1D Binance indicator values.</w:t>
+        <w:t>Data: Binance native 1D candles for BTCUSDT, SOLUSDT, and SUIUSDT.</w:t>
       </w:r>
     </w:p>
     <w:p>
@@ -253,7 +275,7 @@
         <w:pStyle w:val="ListBullet"/>
       </w:pPr>
       <w:r>
-        <w:t>Primary LONG: SSL flips bullish, EMA20 cross within last 3 candles, distance to EMA50 &lt;= 2 ATR, RSI14 &gt; 50.</w:t>
+        <w:t>SSL Channel: SMA(high,14) and SMA(low,14); state flips bullish when close is above high SMA and bearish when close is below low SMA.</w:t>
       </w:r>
     </w:p>
     <w:p>
@@ -261,7 +283,7 @@
         <w:pStyle w:val="ListBullet"/>
       </w:pPr>
       <w:r>
-        <w:t>Primary SHORT: SSL flips bearish, EMA20 cross down within last 3 candles, distance to EMA50 &lt;= 2 ATR, RSI14 &lt; 50.</w:t>
+        <w:t>Primary LONG: SSL flips bullish, price crosses above EMA20 within the last 3 candles, distance from close to EMA50 &lt;= 2 ATR14, and RSI14 &gt; 50.</w:t>
       </w:r>
     </w:p>
     <w:p>
@@ -269,7 +291,7 @@
         <w:pStyle w:val="ListBullet"/>
       </w:pPr>
       <w:r>
-        <w:t>Runner A: close 50% at TP1 = 2.5 ATR, move remaining 50% stop to breakeven, exit runner on opposite SSL flip or stop.</w:t>
+        <w:t>Primary SHORT: SSL flips bearish, price crosses below EMA20 within the last 3 candles, distance from close to EMA50 &lt;= 2 ATR14, and RSI14 &lt; 50.</w:t>
       </w:r>
     </w:p>
     <w:p>
@@ -277,7 +299,7 @@
         <w:pStyle w:val="ListBullet"/>
       </w:pPr>
       <w:r>
-        <w:t>Anti-immediate-reversal: after a profitable runner exit by opposite SSL flip, the system blocks an opposite-direction entry for the next 1 candle.</w:t>
+        <w:t>Anti-immediate-reversal: after a profitable runner exit by opposite SSL flip, block an opposite-direction entry for the next 1 candle.</w:t>
       </w:r>
     </w:p>
     <w:p>
@@ -285,7 +307,31 @@
         <w:pStyle w:val="ListBullet"/>
       </w:pPr>
       <w:r>
-        <w:t>Continuation module is disabled.</w:t>
+        <w:t>Initial stop: 1.5 ATR14 from entry.</w:t>
+      </w:r>
+    </w:p>
+    <w:p>
+      <w:pPr>
+        <w:pStyle w:val="ListBullet"/>
+      </w:pPr>
+      <w:r>
+        <w:t>TP1: 2.5 ATR14 from entry; close 50% at TP1.</w:t>
+      </w:r>
+    </w:p>
+    <w:p>
+      <w:pPr>
+        <w:pStyle w:val="ListBullet"/>
+      </w:pPr>
+      <w:r>
+        <w:t>Runner A: after TP1, move remaining 50% stop to breakeven and exit runner on opposite SSL flip or breakeven stop.</w:t>
+      </w:r>
+    </w:p>
+    <w:p>
+      <w:pPr>
+        <w:pStyle w:val="ListBullet"/>
+      </w:pPr>
+      <w:r>
+        <w:t>Continuation entries are disabled.</w:t>
       </w:r>
     </w:p>
     <w:p>
@@ -301,7 +347,7 @@
         <w:pStyle w:val="ListBullet"/>
       </w:pPr>
       <w:r>
-        <w:t>Cost model remains 0.06% fee and 0.05% slippage per side; funding is not included.</w:t>
+        <w:t>Round-trip trading cost is included in R results.</w:t>
       </w:r>
     </w:p>
     <w:sectPr>

</xml_diff>